<commit_message>
Updated Documents in Week 2
- Updated Meeting Minutes from 29th July
- Created meeting agenda for client meeting
- Created meeting minutes for client meeting
</commit_message>
<xml_diff>
--- a/Documentation/Week 2/Minutes_Group21_Wk2.docx
+++ b/Documentation/Week 2/Minutes_Group21_Wk2.docx
@@ -136,44 +136,14 @@
         <w:rPr>
           <w:lang w:val="en-US"/>
         </w:rPr>
-        <w:t>Christo, Dylan, Murphy (</w:t>
+        <w:t>Christo, Dylan, Murphy (Mengfei), Lithasa</w:t>
       </w:r>
-      <w:proofErr w:type="spellStart"/>
       <w:r>
         <w:rPr>
           <w:lang w:val="en-US"/>
         </w:rPr>
-        <w:t>Mengfei</w:t>
+        <w:t>, Terry, Dhava</w:t>
       </w:r>
-      <w:proofErr w:type="spellEnd"/>
-      <w:r>
-        <w:rPr>
-          <w:lang w:val="en-US"/>
-        </w:rPr>
-        <w:t xml:space="preserve">), </w:t>
-      </w:r>
-      <w:proofErr w:type="spellStart"/>
-      <w:r>
-        <w:rPr>
-          <w:lang w:val="en-US"/>
-        </w:rPr>
-        <w:t>Lithasa</w:t>
-      </w:r>
-      <w:proofErr w:type="spellEnd"/>
-      <w:r>
-        <w:rPr>
-          <w:lang w:val="en-US"/>
-        </w:rPr>
-        <w:t xml:space="preserve">, Terry, </w:t>
-      </w:r>
-      <w:proofErr w:type="spellStart"/>
-      <w:r>
-        <w:rPr>
-          <w:lang w:val="en-US"/>
-        </w:rPr>
-        <w:t>Dhava</w:t>
-      </w:r>
-      <w:proofErr w:type="spellEnd"/>
     </w:p>
     <w:p>
       <w:pPr>
@@ -525,25 +495,7 @@
                 <w:szCs w:val="20"/>
                 <w:lang w:val="en-US"/>
               </w:rPr>
-              <w:t>Murphy (</w:t>
-            </w:r>
-            <w:proofErr w:type="spellStart"/>
-            <w:r>
-              <w:rPr>
-                <w:sz w:val="20"/>
-                <w:szCs w:val="20"/>
-                <w:lang w:val="en-US"/>
-              </w:rPr>
-              <w:t>Mengfei</w:t>
-            </w:r>
-            <w:proofErr w:type="spellEnd"/>
-            <w:r>
-              <w:rPr>
-                <w:sz w:val="20"/>
-                <w:szCs w:val="20"/>
-                <w:lang w:val="en-US"/>
-              </w:rPr>
-              <w:t>) introduced himself and so did group</w:t>
+              <w:t>Murphy (Mengfei) introduced himself and so did group</w:t>
             </w:r>
           </w:p>
         </w:tc>
@@ -815,18 +767,8 @@
                 <w:szCs w:val="20"/>
                 <w:lang w:val="en-US"/>
               </w:rPr>
-              <w:t xml:space="preserve">Go through booking and timesheet </w:t>
-            </w:r>
-            <w:proofErr w:type="spellStart"/>
-            <w:r>
-              <w:rPr>
-                <w:sz w:val="20"/>
-                <w:szCs w:val="20"/>
-                <w:lang w:val="en-US"/>
-              </w:rPr>
-              <w:t>documetation</w:t>
-            </w:r>
-            <w:proofErr w:type="spellEnd"/>
+              <w:t>Go through booking and timesheet documetation</w:t>
+            </w:r>
           </w:p>
         </w:tc>
         <w:tc>
@@ -980,18 +922,32 @@
                 <w:szCs w:val="20"/>
                 <w:lang w:val="en-US"/>
               </w:rPr>
-              <w:t xml:space="preserve">What is the </w:t>
-            </w:r>
-            <w:proofErr w:type="gramStart"/>
-            <w:r>
-              <w:rPr>
-                <w:sz w:val="20"/>
-                <w:szCs w:val="20"/>
-                <w:lang w:val="en-US"/>
-              </w:rPr>
-              <w:t>final outcome</w:t>
-            </w:r>
-            <w:proofErr w:type="gramEnd"/>
+              <w:t>What is the</w:t>
+            </w:r>
+            <w:r>
+              <w:rPr>
+                <w:sz w:val="20"/>
+                <w:szCs w:val="20"/>
+                <w:lang w:val="en-US"/>
+              </w:rPr>
+              <w:t xml:space="preserve"> final</w:t>
+            </w:r>
+            <w:r>
+              <w:rPr>
+                <w:sz w:val="20"/>
+                <w:szCs w:val="20"/>
+                <w:lang w:val="en-US"/>
+              </w:rPr>
+              <w:t xml:space="preserve"> </w:t>
+            </w:r>
+            <w:r>
+              <w:rPr>
+                <w:sz w:val="20"/>
+                <w:szCs w:val="20"/>
+                <w:lang w:val="en-US"/>
+              </w:rPr>
+              <w:t>outcome</w:t>
+            </w:r>
             <w:r>
               <w:rPr>
                 <w:sz w:val="20"/>
@@ -1026,6 +982,14 @@
               </w:rPr>
               <w:t>What do you imagine us doing / completing</w:t>
             </w:r>
+            <w:r>
+              <w:rPr>
+                <w:sz w:val="20"/>
+                <w:szCs w:val="20"/>
+                <w:lang w:val="en-US"/>
+              </w:rPr>
+              <w:t>?</w:t>
+            </w:r>
           </w:p>
           <w:p>
             <w:pPr>
@@ -1052,6 +1016,14 @@
               </w:rPr>
               <w:t>What milestones would you like us to complete</w:t>
             </w:r>
+            <w:r>
+              <w:rPr>
+                <w:sz w:val="20"/>
+                <w:szCs w:val="20"/>
+                <w:lang w:val="en-US"/>
+              </w:rPr>
+              <w:t>?</w:t>
+            </w:r>
           </w:p>
           <w:p>
             <w:pPr>
@@ -1078,6 +1050,14 @@
               </w:rPr>
               <w:t>What metrics are you looking for to judge the work</w:t>
             </w:r>
+            <w:r>
+              <w:rPr>
+                <w:sz w:val="20"/>
+                <w:szCs w:val="20"/>
+                <w:lang w:val="en-US"/>
+              </w:rPr>
+              <w:t>?</w:t>
+            </w:r>
           </w:p>
           <w:p>
             <w:pPr>
@@ -1110,18 +1090,16 @@
                 <w:szCs w:val="20"/>
                 <w:lang w:val="en-US"/>
               </w:rPr>
-              <w:t xml:space="preserve"> us through what is </w:t>
-            </w:r>
-            <w:proofErr w:type="gramStart"/>
-            <w:r>
-              <w:rPr>
-                <w:sz w:val="20"/>
-                <w:szCs w:val="20"/>
-                <w:lang w:val="en-US"/>
-              </w:rPr>
-              <w:t>actually happening</w:t>
-            </w:r>
-            <w:proofErr w:type="gramEnd"/>
+              <w:t xml:space="preserve"> us through what is actually happening</w:t>
+            </w:r>
+            <w:r>
+              <w:rPr>
+                <w:sz w:val="20"/>
+                <w:szCs w:val="20"/>
+                <w:lang w:val="en-US"/>
+              </w:rPr>
+              <w:t>?</w:t>
+            </w:r>
           </w:p>
           <w:p>
             <w:pPr>
@@ -1294,34 +1272,14 @@
                 <w:lang w:val="en-US"/>
               </w:rPr>
             </w:pPr>
-            <w:proofErr w:type="spellStart"/>
-            <w:r>
-              <w:rPr>
-                <w:sz w:val="20"/>
-                <w:szCs w:val="20"/>
-                <w:lang w:val="en-US"/>
-              </w:rPr>
-              <w:t>Lithasa</w:t>
-            </w:r>
-            <w:proofErr w:type="spellEnd"/>
-            <w:r>
-              <w:rPr>
-                <w:sz w:val="20"/>
-                <w:szCs w:val="20"/>
-                <w:lang w:val="en-US"/>
-              </w:rPr>
-              <w:t xml:space="preserve">, Christo, </w:t>
-            </w:r>
-            <w:proofErr w:type="spellStart"/>
-            <w:r>
-              <w:rPr>
-                <w:sz w:val="20"/>
-                <w:szCs w:val="20"/>
-                <w:lang w:val="en-US"/>
-              </w:rPr>
-              <w:t>Dhava</w:t>
-            </w:r>
-            <w:proofErr w:type="spellEnd"/>
+            <w:r>
+              <w:rPr>
+                <w:sz w:val="20"/>
+                <w:szCs w:val="20"/>
+                <w:lang w:val="en-US"/>
+              </w:rPr>
+              <w:t>Lithasa, Christo, Dhava</w:t>
+            </w:r>
           </w:p>
         </w:tc>
       </w:tr>
@@ -1446,6 +1404,14 @@
                 <w:lang w:val="en-US"/>
               </w:rPr>
             </w:pPr>
+            <w:r>
+              <w:rPr>
+                <w:sz w:val="20"/>
+                <w:szCs w:val="20"/>
+                <w:lang w:val="en-US"/>
+              </w:rPr>
+              <w:t>Christo</w:t>
+            </w:r>
           </w:p>
         </w:tc>
       </w:tr>
@@ -1552,23 +1518,37 @@
               </w:rPr>
               <w:t xml:space="preserve">Run through </w:t>
             </w:r>
-            <w:proofErr w:type="gramStart"/>
-            <w:r>
-              <w:rPr>
-                <w:sz w:val="20"/>
-                <w:szCs w:val="20"/>
-                <w:lang w:val="en-US"/>
-              </w:rPr>
-              <w:t>To</w:t>
-            </w:r>
-            <w:proofErr w:type="gramEnd"/>
-            <w:r>
-              <w:rPr>
-                <w:sz w:val="20"/>
-                <w:szCs w:val="20"/>
-                <w:lang w:val="en-US"/>
-              </w:rPr>
-              <w:t xml:space="preserve"> dos on agenda.</w:t>
+            <w:r>
+              <w:rPr>
+                <w:sz w:val="20"/>
+                <w:szCs w:val="20"/>
+                <w:lang w:val="en-US"/>
+              </w:rPr>
+              <w:t>‘to</w:t>
+            </w:r>
+            <w:r>
+              <w:rPr>
+                <w:sz w:val="20"/>
+                <w:szCs w:val="20"/>
+                <w:lang w:val="en-US"/>
+              </w:rPr>
+              <w:t xml:space="preserve"> dos</w:t>
+            </w:r>
+            <w:r>
+              <w:rPr>
+                <w:sz w:val="20"/>
+                <w:szCs w:val="20"/>
+                <w:lang w:val="en-US"/>
+              </w:rPr>
+              <w:t>’</w:t>
+            </w:r>
+            <w:r>
+              <w:rPr>
+                <w:sz w:val="20"/>
+                <w:szCs w:val="20"/>
+                <w:lang w:val="en-US"/>
+              </w:rPr>
+              <w:t xml:space="preserve"> on agenda.</w:t>
             </w:r>
           </w:p>
         </w:tc>

</xml_diff>